<commit_message>
Fix XBRL YTD/quarterly confusion and regenerate financial tasks
- Add date ranges to seed text rendering so LLM can distinguish YTD
  cumulative vs single-quarter values in XBRL data
- Add explicit system prompt instructions for financial task generation
- Update LLM consistency validator with same date range context
- Regenerate financial tasks: 12 accepted (from 28 attempts, ~43% rate)
- Update README stats (84 total: 34 lawyer + 12 financial + 38 SWE)
- Add §4.2 documenting the XBRL fix methodology and three-layer defense
- Regenerate charts with updated numbers

Co-Authored-By: Claude Opus 4.7 <noreply@anthropic.com>
</commit_message>
<xml_diff>
--- a/data/deliverables/sc_114324923fef32c0/credit_memo.docx
+++ b/data/deliverables/sc_114324923fef32c0/credit_memo.docx
@@ -20,7 +20,7 @@
         <w:tab/>
       </w:r>
       <w:r>
-        <w:t>Lending Committee</w:t>
+        <w:t>Credit Committee</w:t>
       </w:r>
     </w:p>
     <w:p>
@@ -32,7 +32,7 @@
         <w:tab/>
       </w:r>
       <w:r>
-        <w:t>Energy Sector Lending Team</w:t>
+        <w:t>Senior Credit Analyst, Energy Portfolio Team</w:t>
       </w:r>
     </w:p>
     <w:p>
@@ -56,7 +56,7 @@
         <w:tab/>
       </w:r>
       <w:r>
-        <w:t>Credit Facility Review - Chevron Corporation (NYSE: CVX)</w:t>
+        <w:t>Credit Review - Chevron Corporation (CVX)</w:t>
       </w:r>
     </w:p>
     <w:p>
@@ -69,36 +69,6 @@
         <w:pStyle w:val="Heading1"/>
       </w:pPr>
       <w:r>
-        <w:t>Credit Memo - Chevron Corporation</w:t>
-      </w:r>
-    </w:p>
-    <w:p>
-      <w:r>
-        <w:rPr>
-          <w:b w:val="0"/>
-        </w:rPr>
-        <w:t>To: Lending Committee</w:t>
-        <w:br/>
-        <w:t>From: Energy Sector Lending Team</w:t>
-        <w:br/>
-        <w:t>Date: May 2026</w:t>
-        <w:br/>
-        <w:t>Re: Credit Facility Review - Chevron Corporation (NYSE: CVX)</w:t>
-      </w:r>
-    </w:p>
-    <w:p>
-      <w:r>
-        <w:rPr>
-          <w:b w:val="0"/>
-        </w:rPr>
-        <w:t>CONFIDENTIAL - FOR INTERNAL USE ONLY</w:t>
-      </w:r>
-    </w:p>
-    <w:p>
-      <w:pPr>
-        <w:pStyle w:val="Heading2"/>
-      </w:pPr>
-      <w:r>
         <w:t>Executive Summary</w:t>
       </w:r>
     </w:p>
@@ -107,7 +77,15 @@
         <w:rPr>
           <w:b w:val="0"/>
         </w:rPr>
-        <w:t>We recommend CONDITIONAL APPROVAL of a $5.0 billion revolving credit facility for Chevron Corporation, subject to covenant protections and periodic review triggers. Chevron is one of the world's largest integrated energy companies, with FY2025 revenues of $189.0 billion, total assets of $329.6 billion as of Q1 2026, and stockholders' equity of $183.7 billion. The company maintains a strong asset base and diversified revenue streams across upstream, downstream, and chemicals operations.</w:t>
+        <w:t>Chevron Corporation (NYSE: CVX) maintains a strong credit profile supported by a robust balance sheet and consistent profitability, despite a moderation in quarterly revenues during Q1 2026. The company reported total revenues of $48.6 billion in Q1 2026, representing a decline from the implied Q4 2025 figure, yet net income remained solid at $2.2 billion with diluted EPS of $1.11. Stockholders' equity stood at $183.7 billion as of March 31, 2026, and total assets grew to $329.6 billion, reflecting continued investment in upstream and downstream assets. The overall credit outlook is stable, supported by Chevron's diversified operations, manageable leverage, and strong cash generation capacity relative to its debt obligations.</w:t>
+      </w:r>
+    </w:p>
+    <w:p>
+      <w:pPr>
+        <w:pStyle w:val="Heading1"/>
+      </w:pPr>
+      <w:r>
+        <w:t>Financial Performance Analysis</w:t>
       </w:r>
     </w:p>
     <w:p>
@@ -115,7 +93,7 @@
         <w:rPr>
           <w:b w:val="0"/>
         </w:rPr>
-        <w:t>Key credit strengths include: (1) massive scale and market position as a publicly traded integrated energy major (NYSE: CVX, CIK: 0000093410); (2) robust equity cushion with stockholders' equity of $183.7 billion supporting total assets of $329.6 billion; (3) consistent profitability with FY2025 net income of $12.3 billion and Q1 2026 net income of $2.2 billion; and (4) manageable cost structure with cost of goods sold representing approximately 57.2% of FY2025 revenues.</w:t>
+        <w:t>Chevron's quarterly revenue trajectory shows the following progression using available single-quarter data: Q3 2025 revenues were $49.7 billion and Q1 2026 revenues were $48.6 billion. The YTD through Q2 2025 was $92.4 billion, and the YTD through Q3 2025 was $142.2 billion, implying Q3 2025 single-quarter revenue of approximately $49.7 billion. The FY 2025 full-year revenue of $189.0 billion implies Q4 2025 revenue of approximately $46.9 billion ($189.0B - $142.2B). The quarterly pattern suggests a slight sequential decline from Q3 2025 to Q4 2025, followed by a stabilization in Q1 2026 at $48.6 billion.</w:t>
       </w:r>
     </w:p>
     <w:p>
@@ -123,7 +101,7 @@
         <w:rPr>
           <w:b w:val="0"/>
         </w:rPr>
-        <w:t>Key credit risks include: (1) commodity price volatility inherent in the energy sector, which directly impacts revenue and margins; (2) significant capital expenditure requirements typical of integrated energy operations; (3) rising total liabilities, which increased from $131.8 billion at FY2025 to $140.2 billion at Q1 2026, an increase of $8.3 billion; and (4) declining net income trend from FY2025 annualized levels, with Q1 2026 net income of $2.2 billion representing a potential run-rate below the prior year's $12.3 billion.</w:t>
+        <w:t>Gross margin analysis reveals that Chevron maintained healthy profitability at the gross level. In Q1 2026, cost of goods and services sold was $28.3 billion against revenues of $48.6 billion, yielding a gross margin of approximately 41.8%. For Q3 2025, cost of goods was $27.4 billion on revenues of $49.7 billion, implying a gross margin of approximately 44.9%. The full-year 2025 gross margin, calculated from revenues of $189.0 billion and costs of $108.2 billion, was approximately 42.8%. The modest compression in Q1 2026 gross margin relative to Q3 2025 warrants monitoring but remains within acceptable ranges for the integrated energy sector.</w:t>
       </w:r>
     </w:p>
     <w:p>
@@ -131,15 +109,7 @@
         <w:rPr>
           <w:b w:val="0"/>
         </w:rPr>
-        <w:t>Proposed facility terms: $5.0 billion revolving credit facility with a 5-year tenor, financial covenants requiring maintenance of a debt-to-equity ratio not exceeding 0.80x, minimum interest coverage of 3.0x, and semi-annual financial reporting requirements. Pricing at SOFR + 150bps with a commitment fee of 30bps on undrawn amounts.</w:t>
-      </w:r>
-    </w:p>
-    <w:p>
-      <w:pPr>
-        <w:pStyle w:val="Heading2"/>
-      </w:pPr>
-      <w:r>
-        <w:t>Company Overview</w:t>
+        <w:t>Net income declined sequentially from Q3 2025's $3.5 billion to Q1 2026's $2.2 billion, a decrease of approximately 37%. Diluted EPS followed a similar trajectory, falling from $1.82 in Q3 2025 to $1.11 in Q1 2026. The full-year 2025 net income was $12.3 billion with diluted EPS of $6.63. The implied Q4 2025 net income was approximately $2.8 billion ($12.3B - $9.5B YTD through Q3). The quarterly decline in profitability reflects lower commodity price realizations and increased operating costs, though the company remains solidly profitable.</w:t>
       </w:r>
     </w:p>
     <w:p>
@@ -147,7 +117,15 @@
         <w:rPr>
           <w:b w:val="0"/>
         </w:rPr>
-        <w:t>Chevron Corporation (NYSE: CVX) is a major integrated energy company operating in the energy sector. The company is registered with the SEC under CIK number 0000093410 and files periodic reports with the Securities and Exchange Commission. As of the most recent data available, Chevron's most recent quarterly report (10-Q) was filed on May 7, 2026, with additional Form 4 filings and a Form SD filing submitted on May 8, 2026.</w:t>
+        <w:t>SG&amp;A expense as a percentage of revenue remained well-controlled. In Q1 2026, SG&amp;A was $1.07 billion on revenues of $48.6 billion, representing 2.2% of revenue. In Q3 2025, SG&amp;A was $1.52 billion on revenues of $49.7 billion, or 3.1% of revenue. The full-year 2025 SG&amp;A ratio was 2.7% ($5.1 billion on $189.0 billion in revenues). The lower Q1 2026 SG&amp;A ratio indicates effective cost discipline, which partially offsets gross margin compression.</w:t>
+      </w:r>
+    </w:p>
+    <w:p>
+      <w:pPr>
+        <w:pStyle w:val="Heading1"/>
+      </w:pPr>
+      <w:r>
+        <w:t>Leverage and Balance Sheet Strength</w:t>
       </w:r>
     </w:p>
     <w:p>
@@ -155,7 +133,7 @@
         <w:rPr>
           <w:b w:val="0"/>
         </w:rPr>
-        <w:t>As an integrated energy company, Chevron operates across the full value chain of the energy industry, including exploration and production (upstream), refining and marketing (downstream), and chemicals manufacturing. The company's massive revenue base of $189.0 billion in FY2025 and total assets of $329.6 billion as of Q1 2026 position it among the largest publicly traded corporations globally.</w:t>
+        <w:t>As of Q1 2026, Chevron's total liabilities were $140.2 billion against stockholders' equity of $183.7 billion, yielding a total debt-to-equity ratio of approximately 0.76x. This ratio indicates that the company funds a significant portion of its asset base with equity rather than debt, a credit-positive characteristic. Total assets of $329.6 billion provide an asset coverage ratio of 2.35x relative to total liabilities, demonstrating that assets substantially exceed liabilities.</w:t>
       </w:r>
     </w:p>
     <w:p>
@@ -163,15 +141,7 @@
         <w:rPr>
           <w:b w:val="0"/>
         </w:rPr>
-        <w:t>Chevron's financial profile reflects the capital-intensive nature of the energy industry. The company reported research and development expenses of $427 million in FY2025, an increase from $353 million in FY2024 and $320 million in FY2023, indicating ongoing investment in technology and operational efficiency. Selling, general and administrative expenses totaled $5.1 billion in FY2025, representing approximately 2.7% of total revenues.</w:t>
-      </w:r>
-    </w:p>
-    <w:p>
-      <w:pPr>
-        <w:pStyle w:val="Heading2"/>
-      </w:pPr>
-      <w:r>
-        <w:t>Financial Analysis</w:t>
+        <w:t>Stockholders' equity decreased modestly from $186.5 billion at FY 2025 year-end to $183.7 billion at Q1 2026, a decline of approximately $2.8 billion or 1.5%. This reduction likely reflects share repurchase activity and dividend payments that exceeded the period's net income of $2.2 billion. While the trend bears monitoring, the absolute level of equity remains substantial.</w:t>
       </w:r>
     </w:p>
     <w:p>
@@ -179,7 +149,7 @@
         <w:rPr>
           <w:b w:val="0"/>
         </w:rPr>
-        <w:t>Revenue Trends: Chevron reported total revenues of $189.0 billion for FY2025 and $48.6 billion for Q1 2026. Revenue excluding assessed taxes was $184.4 billion for FY2025 and $47.6 billion for Q1 2026. Quarterly revenue progression in FY2025 showed Q2 revenues of $92.4 billion and Q3 revenues (cumulative nine months) of $142.2 billion, with Q3 standalone revenues of approximately $49.7 billion. The Q1 2026 revenue of $48.6 billion is comparable to Q3 2025 standalone revenues of $49.7 billion, suggesting relatively stable quarterly revenue generation. Year-over-year revenue growth analysis is limited by available historical data, but the Q1 2026 figure suggests continued robust top-line performance.</w:t>
+        <w:t>Cash and cash equivalents data available from the filing shows $8.2 billion at FY 2023 year-end and $4.0 billion as of Q2 2024, indicating a drawdown in liquidity reserves during that period. More recent cash data is not available in the provided dataset, but the company's strong operating cash flows from its integrated operations suggest adequate liquidity to meet near-term obligations. The asset base grew from $324.0 billion at FY 2025 to $329.6 billion at Q1 2026, an increase of $5.5 billion, reflecting ongoing capital investment.</w:t>
       </w:r>
     </w:p>
     <w:p>
@@ -187,7 +157,15 @@
         <w:rPr>
           <w:b w:val="0"/>
         </w:rPr>
-        <w:t>Profitability: Net income for FY2025 was $12.3 billion, yielding a net profit margin of approximately 6.5% ($12.3B / $189.0B). Q1 2026 net income was $2.2 billion on revenues of $48.6 billion, representing a net profit margin of approximately 4.5%. This margin compression from 6.5% to 4.5% warrants close monitoring. Diluted earnings per share followed a similar trajectory, declining from $6.63 for FY2025 to $1.11 for Q1 2026. On an annualized basis, Q1 2026 EPS of $1.11 would imply approximately $4.44 for the full year, representing a potential 33% decline from FY2025 levels. However, quarterly earnings can be volatile in the energy sector and annualization may not reflect seasonal patterns.</w:t>
+        <w:t>The leverage profile is consistent with investment-grade credit quality. Chevron's ability to generate substantial free cash flow from its upstream production and downstream refining operations provides a natural hedge against commodity price volatility. The company's R&amp;D spending increased from $320 million in FY 2023 to $353 million in FY 2024 and further to $427 million in FY 2025, reflecting a 21% increase over two years. This investment in technology and innovation supports long-term competitive positioning but should be evaluated against near-term cash flow generation.</w:t>
+      </w:r>
+    </w:p>
+    <w:p>
+      <w:pPr>
+        <w:pStyle w:val="Heading1"/>
+      </w:pPr>
+      <w:r>
+        <w:t>Credit Risk Assessment</w:t>
       </w:r>
     </w:p>
     <w:p>
@@ -195,7 +173,7 @@
         <w:rPr>
           <w:b w:val="0"/>
         </w:rPr>
-        <w:t>Balance Sheet: As of Q1 2026, Chevron reported total assets of $329.6 billion, total liabilities of $140.2 billion, and stockholders' equity of $183.7 billion. The resulting debt-to-equity ratio is approximately 0.76x ($140.2B / $183.7B), indicating that the company finances approximately 43% of its assets with debt. Total liabilities increased from $131.8 billion at FY2025 to $140.2 billion at Q1 2026, an increase of $8.3 billion or 6.3% in a single quarter. Meanwhile, stockholders' equity decreased from $186.5 billion to $183.7 billion, a decline of $2.7 billion. This divergence suggests the company may be taking on leverage while equity is contracting, a trend that requires monitoring.</w:t>
+        <w:t>The first key credit risk is commodity price volatility and its direct impact on revenue and profitability. Chevron's revenues are fundamentally tied to crude oil and natural gas prices, which are subject to significant global macroeconomic and geopolitical factors. The sequential decline in quarterly net income from $3.5 billion in Q3 2025 to $2.2 billion in Q1 2026, a 37% decrease, illustrates the sensitivity of earnings to commodity price cycles. While the company's integrated model provides some buffer through downstream margins, the upstream segment remains the primary driver of overall profitability.</w:t>
       </w:r>
     </w:p>
     <w:p>
@@ -203,7 +181,7 @@
         <w:rPr>
           <w:b w:val="0"/>
         </w:rPr>
-        <w:t>Liquidity: Cash and cash equivalents data is limited to older periods, with the most recent available figure being $4.0 billion as of Q2 2024. Historical cash balances show a declining trend from $8.2 billion at FY2023 to $6.3 billion in Q1 2024 and $4.0 billion in Q2 2024. The absence of current Q1 2026 cash data limits our liquidity assessment. However, given total assets of $329.6 billion and the company's ability to generate operating cash flows (as evidenced by $12.3 billion in FY2025 net income), liquidity risk appears manageable but warrants further investigation through the full 10-Q filing.</w:t>
+        <w:t>The second credit risk is the potential for rising operating costs to erode margins. SG&amp;A expenses have shown volatility, ranging from $1.52 billion in Q3 2025 to $1.07 billion in Q1 2026. More significantly, cost of goods and services sold represents the largest expense category, consuming 58% of revenues in Q1 2026 ($28.3 billion of $48.6 billion). Any sustained increase in production costs, labor expenses, or regulatory compliance costs could compress margins further, particularly in a lower commodity price environment.</w:t>
       </w:r>
     </w:p>
     <w:p>
@@ -211,15 +189,7 @@
         <w:rPr>
           <w:b w:val="0"/>
         </w:rPr>
-        <w:t>Operating Efficiency: Cost of goods and services sold was $108.2 billion for FY2025 and $28.3 billion for Q1 2026. As a percentage of revenue, COGS represented 57.2% in FY2025 ($108.2B / $189.0B) and 58.2% in Q1 2026 ($28.3B / $48.6B). The slight increase in cost ratio in Q1 2026 aligns with the observed margin compression. R&amp;D spending increased year-over-year from $320 million in FY2023 to $353 million in FY2024 to $427 million in FY2025, representing a cumulative increase of 33.4% over two years, suggesting the company is investing in technology and innovation to maintain competitive positioning.</w:t>
-      </w:r>
-    </w:p>
-    <w:p>
-      <w:pPr>
-        <w:pStyle w:val="Heading2"/>
-      </w:pPr>
-      <w:r>
-        <w:t>Risk Assessment</w:t>
+        <w:t>The third credit risk relates to the decline in cash and liquidity reserves. Available data shows cash declining from $8.2 billion at FY 2023 to $4.0 billion at Q2 2024, a drawdown of over 50%. While the company continues to invest heavily in capital projects, evidenced by the growth in total assets from $324.0 billion at FY 2025 to $329.6 billion at Q1 2026, the pace of asset growth must be supported by adequate liquidity. A sustained period of lower commodity prices could strain the company's ability to fund both capital expenditures and shareholder returns without incurring additional debt.</w:t>
       </w:r>
     </w:p>
     <w:p>
@@ -227,7 +197,15 @@
         <w:rPr>
           <w:b w:val="0"/>
         </w:rPr>
-        <w:t>Commodity Price Risk: As an integrated energy company operating in the energy sector, Chevron's revenues and profitability are directly exposed to fluctuations in oil and natural gas prices. The observed margin compression between FY2025 and Q1 2026 (net profit margin declining from 6.5% to 4.5%) may reflect adverse commodity price movements or shifts in the production mix. Quarterly revenue volatility is evident in the data, with Q2 2025 revenues of $92.4 billion and Q3 2025 revenues of $49.7 billion demonstrating significant variability. A sustained downturn in commodity prices could materially impact Chevron's ability to service debt obligations.</w:t>
+        <w:t>Additionally, the increase in R&amp;D spending from $320 million in FY 2023 to $427 million in FY 2025, while positive for long-term competitiveness, represents an incremental cash outflow commitment. This spending must be weighed against the company's broader capital allocation priorities, including the $183.7 billion equity base and the need to maintain investment-grade leverage metrics.</w:t>
+      </w:r>
+    </w:p>
+    <w:p>
+      <w:pPr>
+        <w:pStyle w:val="Heading1"/>
+      </w:pPr>
+      <w:r>
+        <w:t>Recommendation</w:t>
       </w:r>
     </w:p>
     <w:p>
@@ -235,7 +213,7 @@
         <w:rPr>
           <w:b w:val="0"/>
         </w:rPr>
-        <w:t>Capital Intensity Risk: The energy sector requires substantial ongoing capital investment to maintain production levels and develop new reserves. Chevron's R&amp;D spending has increased from $320 million in FY2023 to $427 million in FY2025, a 33.4% increase over two years, reflecting the ongoing need for technological investment. Additionally, the increase in total assets from $324.0 billion at FY2025 to $329.6 billion at Q1 2026, combined with rising liabilities, suggests continued capital deployment. High capital requirements may limit financial flexibility during commodity downturns.</w:t>
+        <w:t>Based on the analysis of Chevron's Q1 2026 financial data and recent trends, the recommendation is to Maintain Exposure at current levels. This assessment is supported by several factors: the company's strong equity base of $183.7 billion provides a substantial cushion against potential losses; the debt-to-equity ratio of 0.76x remains well within investment-grade parameters; and the company's integrated business model diversifies revenue streams across upstream, downstream, and chemicals operations.</w:t>
       </w:r>
     </w:p>
     <w:p>
@@ -243,7 +221,7 @@
         <w:rPr>
           <w:b w:val="0"/>
         </w:rPr>
-        <w:t>Leverage Trajectory Risk: The most concerning trend identified in the data is the rapid increase in leverage. Total liabilities increased by $8.3 billion (6.3%) in a single quarter from $131.8 billion at FY2025 to $140.2 billion at Q1 2026. Concurrently, stockholders' equity declined by $2.7 billion from $186.5 billion to $183.7 billion. This combination drove the debt-to-equity ratio from approximately 0.71x at FY2025 to approximately 0.76x at Q1 2026. If this trajectory continues, the company could approach the proposed covenant threshold of 0.80x within the next few quarters. The divergence between rising liabilities and declining equity represents a key monitoring point for the proposed credit facility.</w:t>
+        <w:t>The primary considerations supporting this recommendation include Chevron's consistent profitability, with net income of $12.3 billion in FY 2025 and $2.2 billion in Q1 2026, and its demonstrated ability to maintain gross margins above 40% despite commodity price fluctuations. The SG&amp;A discipline evidenced by the 2.2% ratio in Q1 2026 further supports operational efficiency. The asset coverage ratio of 2.35x provides additional comfort regarding the company's ability to absorb potential losses.</w:t>
       </w:r>
     </w:p>
     <w:p>
@@ -251,47 +229,7 @@
         <w:rPr>
           <w:b w:val="0"/>
         </w:rPr>
-        <w:t>Margin Compression Risk: Q1 2026 profitability metrics showed deterioration compared to FY2025 averages. The net profit margin declined from 6.5% to 4.5%, and COGS as a percentage of revenue increased from 57.2% to 58.2%. Diluted EPS of $1.11 in Q1 2026, when annualized, suggests potential full-year EPS of approximately $4.44 compared to $6.63 in FY2025, a 33% decline. While quarterly results can be volatile, the combination of rising costs, declining margins, and increasing leverage warrants heightened scrutiny. SG&amp;A expenses of $1.1 billion in Q1 2026 on an annualized basis would approximate $4.3 billion, below the FY2025 level of $5.1 billion, suggesting some cost discipline in overhead.</w:t>
-      </w:r>
-    </w:p>
-    <w:p>
-      <w:pPr>
-        <w:pStyle w:val="Heading2"/>
-      </w:pPr>
-      <w:r>
-        <w:t>Conclusion and Recommendation</w:t>
-      </w:r>
-    </w:p>
-    <w:p>
-      <w:r>
-        <w:rPr>
-          <w:b w:val="0"/>
-        </w:rPr>
-        <w:t>Based on our analysis of Chevron Corporation's financial position as of Q1 2026, we assign a credit risk rating of BBB+ (Investment Grade - Adequate). Chevron's massive scale ($189.0 billion in FY2025 revenues, $329.6 billion in total assets), consistent profitability ($12.3 billion FY2025 net income, $2.2 billion Q1 2026 net income), and strong equity base ($183.7 billion stockholders' equity) support investment-grade creditworthiness. The current debt-to-equity ratio of 0.76x remains within acceptable parameters.</w:t>
-      </w:r>
-    </w:p>
-    <w:p>
-      <w:r>
-        <w:rPr>
-          <w:b w:val="0"/>
-        </w:rPr>
-        <w:t>However, the observed trends of rising liabilities ($8.3 billion increase in one quarter), declining equity ($2.7 billion decrease), and margin compression (net profit margin declining from 6.5% to 4.5%) introduce meaningful risk factors that must be monitored. We recommend CONDITIONAL APPROVAL of the $5.0 billion revolving credit facility subject to the following conditions:</w:t>
-      </w:r>
-    </w:p>
-    <w:p>
-      <w:r>
-        <w:rPr>
-          <w:b w:val="0"/>
-        </w:rPr>
-        <w:t>Proposed Covenants and Conditions: (1) Maximum debt-to-equity ratio of 0.80x, tested quarterly; (2) Minimum interest coverage ratio of 3.0x; (3) Minimum stockholders' equity of $175.0 billion; (4) Semi-annual financial reporting with delivery of 10-Q and 10-K within 45 days of filing; (5) Material adverse change clause triggered by any credit rating downgrade below investment grade; (6) Commitment reduction mechanism if debt-to-equity exceeds 0.78x for two consecutive quarters.</w:t>
-      </w:r>
-    </w:p>
-    <w:p>
-      <w:r>
-        <w:rPr>
-          <w:b w:val="0"/>
-        </w:rPr>
-        <w:t>The facility pricing should reflect the BBB+ risk rating at SOFR + 150bps with a 30bps commitment fee on undrawn balances. We recommend annual review of the facility with the next comprehensive review scheduled upon availability of FY2026 data. The bank should obtain the complete Q1 2026 10-Q filing (filed May 7, 2026) for detailed cash flow analysis and supplemental disclosures not available in the current data package.</w:t>
+        <w:t>Key risks to monitor include further deterioration in commodity prices, which could reduce revenues below the $48.6 billion quarterly run-rate observed in Q1 2026, and any acceleration in cash outflows that could weaken liquidity reserves. The credit committee should revisit this assessment if quarterly net income falls below $1.5 billion for two consecutive quarters or if the debt-to-equity ratio exceeds 1.0x. The increase in R&amp;D spending to $427 million in FY 2025 should be tracked to ensure it remains aligned with the company's strategic priorities and does not materially impact near-term cash flow generation.</w:t>
       </w:r>
     </w:p>
     <w:sectPr>

</xml_diff>